<commit_message>
feat: add INDECI ingestion script
Descarga el historico de emergencias (2012-2023) desde la API CKAN de
datosabiertos.gob.pe, usando la serie "Mapa de Emergencias" (shapefile ZIP
por anio), verificada como la unica ruta de descarga funcional: el dataset
tabular CSV/XLS separado tiene sus enlaces rotos en el servidor de INDECI.
Corrige el informe (seccion 2.4) para reflejar la ventana de datos real
(2012-2023, no 2014-2026) y aclara en data/bronze/README.md que la escritura
del dato crudo la hace ingestion/, no los notebooks de bronze.
</commit_message>
<xml_diff>
--- a/docs/Informe_Final_Proyecto_BI.docx
+++ b/docs/Informe_Final_Proyecto_BI.docx
@@ -518,6 +518,14 @@
       </w:pPr>
       <w:r>
         <w:t>SENAMHI cuenta con datos de estaciones meteorológicas e hidrológicas (incluyendo nivel de río), accesibles hoy solo mediante herramientas de terceros no oficiales (por ejemplo, Garúa), que obtienen los datos mediante scraping del sitio web y la superación de una verificación Cloudflare, no mediante una API pública documentada. Por el mismo criterio aplicado a otras fuentes descartadas, esta opción queda fuera del núcleo del proyecto: se registra como una extensión futura evaluada y no incorporada, dado que introduce una dependencia técnica frágil incompatible con el criterio de viabilidad técnica definido en la sección 2.3. De incorporarse más adelante, su principal aporte sería la variable de nivel de río, hoy no cubierta por ninguna de las cuatro fuentes del núcleo.</w:t>
+      </w:r>
+    </w:p>
+    <w:p>
+      <w:pPr>
+        <w:pStyle w:val="ListBullet"/>
+      </w:pPr>
+      <w:r>
+        <w:t>Aunque el histórico de INDECI (SINPAD) está disponible desde 2003, el proyecto acota la ventana de entrenamiento y análisis a los últimos 12 años con datos realmente publicados en el portal de datos abiertos (2012-2023, el año más reciente disponible al momento de este informe). Esto responde a tres motivos: los registros de SINPAD más recientes son más consistentes y están mejor digitalizados que los de los primeros años; la constelación VIIRS que usa NASA FIRMS para su detección de mayor resolución solo tiene cobertura confiable desde aproximadamente 2012, por lo que ir más atrás dejaría esa fuente sin datos reales que cruzar; y acotar el volumen de datos reduce el costo de cómputo en Azure Databricks, relevante dado el crédito limitado de Azure for Students. Esta ventana igual cubre varios ciclos de El Niño/La Niña costero (sección 1.3). Se verificó además, contra la API real de INDECI, que el dataset tabular separado (CSV/XLS, 2003-2018) tiene sus enlaces de descarga rotos en el servidor de archivos del portal; el proyecto usa en su lugar, de forma uniforme para toda la ventana 2012-2023, la serie "Mapa de Emergencias" (un shapefile ZIP por año), lo que confirma y hace explícita la necesidad de procesamiento geoespacial ya señalada en esta sección.</w:t>
       </w:r>
     </w:p>
     <w:p>

</xml_diff>